<commit_message>
Add illustrated Word draft for chapter 2 part 1
</commit_message>
<xml_diff>
--- a/deliverables/문병로_교수의_메트릭_스튜디오_02_2부부터_4부_게시용.docx
+++ b/deliverables/문병로_교수의_메트릭_스튜디오_02_2부부터_4부_게시용.docx
@@ -789,6 +789,18 @@
       </w:r>
     </w:p>
     <w:p>
+      <w:pPr>
+        <w:spacing w:after="160" w:line="320" w:lineRule="auto"/>
+      </w:pPr>
+      <w:r>
+        <w:rPr>
+          <w:rFonts w:ascii="Malgun Gothic" w:hAnsi="Malgun Gothic" w:eastAsia="Malgun Gothic"/>
+          <w:sz w:val="22"/>
+        </w:rPr>
+        <w:t>이 글은 투자 권유가 아니다. 원천 뉴스 커버리지로 넓힌 뒤 대리변수의 해석이 무너지는지를 확인한 연구 기록이다.</w:t>
+      </w:r>
+    </w:p>
+    <w:p>
       <w:r>
         <w:br w:type="page"/>
       </w:r>
@@ -1414,6 +1426,18 @@
           <w:sz w:val="19"/>
         </w:rPr>
         <w:t>구성요소 벤치마크 결과: https://github.com/Rowoon-Lee5/metric_studio_by_moon/blob/main/results/consensus_benchmark_summary.csv</w:t>
+      </w:r>
+    </w:p>
+    <w:p>
+      <w:pPr>
+        <w:spacing w:after="160" w:line="320" w:lineRule="auto"/>
+      </w:pPr>
+      <w:r>
+        <w:rPr>
+          <w:rFonts w:ascii="Malgun Gothic" w:hAnsi="Malgun Gothic" w:eastAsia="Malgun Gothic"/>
+          <w:sz w:val="22"/>
+        </w:rPr>
+        <w:t>이 글은 투자 권유가 아니다. 하나의 데이터 생성 과정에 의존한 모델 투표가 독립된 증거가 될 수 있는지 점검한 연구 기록이다.</w:t>
       </w:r>
     </w:p>
     <w:p>
@@ -2649,6 +2673,18 @@
         <w:t>이 글은 투자 권유가 아니다. 작은 표본의 패턴을 매매 규칙으로 착각하지 않기 위한 연구 기록이다.</w:t>
       </w:r>
     </w:p>
+    <w:p>
+      <w:pPr>
+        <w:spacing w:after="160" w:line="320" w:lineRule="auto"/>
+      </w:pPr>
+      <w:r>
+        <w:rPr>
+          <w:rFonts w:ascii="Malgun Gothic" w:hAnsi="Malgun Gothic" w:eastAsia="Malgun Gothic"/>
+          <w:sz w:val="22"/>
+        </w:rPr>
+        <w:t>이 글은 투자 권유가 아니다. 작은 표본의 패턴을 매매 규칙으로 착각하지 않기 위한 연구 기록이다.</w:t>
+      </w:r>
+    </w:p>
     <w:sectPr>
       <w:footerReference w:type="default" r:id="rId9"/>
       <w:pgSz w:w="12240" w:h="15840"/>

</xml_diff>

<commit_message>
Align chapter 2 posts with personal blog narrative flow
</commit_message>
<xml_diff>
--- a/deliverables/문병로_교수의_메트릭_스튜디오_02_2부부터_4부_게시용.docx
+++ b/deliverables/문병로_교수의_메트릭_스튜디오_02_2부부터_4부_게시용.docx
@@ -90,7 +90,19 @@
           <w:rFonts w:ascii="Malgun Gothic" w:hAnsi="Malgun Gothic" w:eastAsia="Malgun Gothic"/>
           <w:sz w:val="22"/>
         </w:rPr>
-        <w:t>2장에서 저자는 대중의 관심을 많이 받는 인기주의 예후가 상대적으로 나쁠 수 있다고 말한다. 사람들이 한 종목에 몰리면 기대가 가격에 먼저 반영되고, 이후 수익률은 낮아질 수 있다는 설명이다. 이 주장은 직관적이다. 그래서 더 위험하다. 데이터를 돌리기 전에 ‘관심’이 정확히 무엇인지부터 정하지 않으면, 결과는 쉽게 내가 원하는 이야기로 바뀐다.</w:t>
+        <w:t>1편에서 유동성 조건을 움직여 보며, 숫자 하나에 너무 많은 의미를 넣고 있었다는 문제를 만났다. 유동성이 높다는 말에는 거래 가능성, 시장참여자, 주문 충격이 함께 들어 있다. 2장에 나온 인기주 이야기를 읽자 같은 문제가 다시 보였다.</w:t>
+      </w:r>
+    </w:p>
+    <w:p>
+      <w:pPr>
+        <w:spacing w:after="160" w:line="320" w:lineRule="auto"/>
+      </w:pPr>
+      <w:r>
+        <w:rPr>
+          <w:rFonts w:ascii="Malgun Gothic" w:hAnsi="Malgun Gothic" w:eastAsia="Malgun Gothic"/>
+          <w:sz w:val="22"/>
+        </w:rPr>
+        <w:t>저자는 대중의 관심을 많이 받는 인기주의 예후가 상대적으로 나쁠 수 있다고 말한다. 사람들이 한 종목에 몰리면 기대가 가격에 먼저 반영되고, 이후 수익률은 낮아질 수 있다는 설명이다. 이 주장은 직관적이다. 그래서 더 위험하다. 데이터를 돌리기 전에 ‘관심’이 정확히 무엇인지부터 정하지 않으면, 결과는 쉽게 내가 원하는 이야기로 바뀐다.</w:t>
       </w:r>
     </w:p>
     <w:p>
@@ -822,7 +834,19 @@
           <w:rFonts w:ascii="Malgun Gothic" w:hAnsi="Malgun Gothic" w:eastAsia="Malgun Gothic"/>
           <w:sz w:val="22"/>
         </w:rPr>
-        <w:t>2장에서 저자는 패턴과 운용 전략을 함께 최적화해야 하며, 한 시장에서 작동한 전략이 다른 시장에서는 실패할 수 있다고 설명한다. 이 문장을 읽으면 한 가지 보완책이 떠오른다. 여러 전략이 동시에 고른 종목만 사면, 한 전략의 우연한 실수를 줄일 수 있지 않을까.</w:t>
+        <w:t>1편에서는 결과가 인접한 비용과 유동성 조건에서 남는지를 봤고, 2편에서는 거래회전율을 관심이라는 한 단어로 부르는 일을 멈췄다. 다음에는 자연스럽게 이런 생각이 남았다. 하나의 모델을 믿기 어렵다면, 여러 모델이 동시에 고른 종목만 사면 되지 않을까.</w:t>
+      </w:r>
+    </w:p>
+    <w:p>
+      <w:pPr>
+        <w:spacing w:after="160" w:line="320" w:lineRule="auto"/>
+      </w:pPr>
+      <w:r>
+        <w:rPr>
+          <w:rFonts w:ascii="Malgun Gothic" w:hAnsi="Malgun Gothic" w:eastAsia="Malgun Gothic"/>
+          <w:sz w:val="22"/>
+        </w:rPr>
+        <w:t>2장에서 저자는 패턴과 운용 전략을 함께 최적화해야 하며, 한 시장에서 작동한 전략이 다른 시장에서는 실패할 수 있다고 설명한다. 이 문장을 읽으면 위의 보완책은 상당히 안전해 보인다. 여러 전략이 동시에 고른 종목만 사면, 한 전략의 우연한 실수를 줄일 수 있지 않을까.</w:t>
       </w:r>
     </w:p>
     <w:p>
@@ -1463,6 +1487,18 @@
       </w:pPr>
       <w:r>
         <w:t>[문병로 교수의 메트릭 스튜디오 02] 2장 시장관찰 ④ 시장은 가격보다 먼저 모델의 실패로 드러날 수 있을까</w:t>
+      </w:r>
+    </w:p>
+    <w:p>
+      <w:pPr>
+        <w:spacing w:after="160" w:line="320" w:lineRule="auto"/>
+      </w:pPr>
+      <w:r>
+        <w:rPr>
+          <w:rFonts w:ascii="Malgun Gothic" w:hAnsi="Malgun Gothic" w:eastAsia="Malgun Gothic"/>
+          <w:sz w:val="22"/>
+        </w:rPr>
+        <w:t>3편에서 가격·거래량·시가총액 패널에서 나온 모델들의 합의가 안전장치가 아니라는 결과를 확인했다. 그 뒤에는 한 모델의 승자를 고르는 일보다, 여러 모델이 같은 시점에 무너지는 장면을 보는 편이 더 중요하다는 생각이 남았다.</w:t>
       </w:r>
     </w:p>
     <w:p>

</xml_diff>